<commit_message>
Added images to guided lab
</commit_message>
<xml_diff>
--- a/module-4/M4_Lecture_dolan.docx
+++ b/module-4/M4_Lecture_dolan.docx
@@ -4,6 +4,7 @@
   <w:body>
     <w:p>
       <w:pPr>
+        <w:pStyle w:val="Caption"/>
         <w:keepNext/>
       </w:pPr>
       <w:r>
@@ -11,10 +12,10 @@
           <w:noProof/>
         </w:rPr>
         <w:drawing>
-          <wp:inline distT="0" distB="0" distL="0" distR="0" wp14:anchorId="0700FB81" wp14:editId="4DBF3727">
-            <wp:extent cx="5943600" cy="3615690"/>
-            <wp:effectExtent l="0" t="0" r="0" b="3810"/>
-            <wp:docPr id="2020819629" name="Picture 1"/>
+          <wp:inline distT="0" distB="0" distL="0" distR="0" wp14:anchorId="46E2E779" wp14:editId="6A3E8E18">
+            <wp:extent cx="5943600" cy="3714750"/>
+            <wp:effectExtent l="0" t="0" r="0" b="6350"/>
+            <wp:docPr id="330875347" name="Picture 1"/>
             <wp:cNvGraphicFramePr>
               <a:graphicFrameLocks xmlns:a="http://schemas.openxmlformats.org/drawingml/2006/main" noChangeAspect="1"/>
             </wp:cNvGraphicFramePr>
@@ -22,138 +23,11 @@
               <a:graphicData uri="http://schemas.openxmlformats.org/drawingml/2006/picture">
                 <pic:pic xmlns:pic="http://schemas.openxmlformats.org/drawingml/2006/picture">
                   <pic:nvPicPr>
-                    <pic:cNvPr id="2020819629" name="Picture 2020819629"/>
+                    <pic:cNvPr id="330875347" name="Picture 330875347"/>
                     <pic:cNvPicPr/>
                   </pic:nvPicPr>
                   <pic:blipFill>
                     <a:blip r:embed="rId4" cstate="print">
-                      <a:extLst>
-                        <a:ext uri="{28A0092B-C50C-407E-A947-70E740481C1C}">
-                          <a14:useLocalDpi xmlns:a14="http://schemas.microsoft.com/office/drawing/2010/main" val="0"/>
-                        </a:ext>
-                      </a:extLst>
-                    </a:blip>
-                    <a:stretch>
-                      <a:fillRect/>
-                    </a:stretch>
-                  </pic:blipFill>
-                  <pic:spPr>
-                    <a:xfrm>
-                      <a:off x="0" y="0"/>
-                      <a:ext cx="5943600" cy="3615690"/>
-                    </a:xfrm>
-                    <a:prstGeom prst="rect">
-                      <a:avLst/>
-                    </a:prstGeom>
-                  </pic:spPr>
-                </pic:pic>
-              </a:graphicData>
-            </a:graphic>
-          </wp:inline>
-        </w:drawing>
-      </w:r>
-    </w:p>
-    <w:p>
-      <w:pPr>
-        <w:pStyle w:val="Caption"/>
-      </w:pPr>
-      <w:fldSimple w:instr=" SEQ Figure \* ARABIC ">
-        <w:r>
-          <w:rPr>
-            <w:noProof/>
-          </w:rPr>
-          <w:t>1</w:t>
-        </w:r>
-      </w:fldSimple>
-      <w:r>
-        <w:t xml:space="preserve"> Available Books (1.1)</w:t>
-      </w:r>
-    </w:p>
-    <w:p>
-      <w:pPr>
-        <w:keepNext/>
-      </w:pPr>
-      <w:r>
-        <w:rPr>
-          <w:noProof/>
-        </w:rPr>
-        <w:drawing>
-          <wp:inline distT="0" distB="0" distL="0" distR="0" wp14:anchorId="6BCFA18B" wp14:editId="562E6AAC">
-            <wp:extent cx="5943600" cy="3604895"/>
-            <wp:effectExtent l="0" t="0" r="0" b="1905"/>
-            <wp:docPr id="899057754" name="Picture 3"/>
-            <wp:cNvGraphicFramePr>
-              <a:graphicFrameLocks xmlns:a="http://schemas.openxmlformats.org/drawingml/2006/main" noChangeAspect="1"/>
-            </wp:cNvGraphicFramePr>
-            <a:graphic xmlns:a="http://schemas.openxmlformats.org/drawingml/2006/main">
-              <a:graphicData uri="http://schemas.openxmlformats.org/drawingml/2006/picture">
-                <pic:pic xmlns:pic="http://schemas.openxmlformats.org/drawingml/2006/picture">
-                  <pic:nvPicPr>
-                    <pic:cNvPr id="899057754" name="Picture 899057754"/>
-                    <pic:cNvPicPr/>
-                  </pic:nvPicPr>
-                  <pic:blipFill>
-                    <a:blip r:embed="rId5" cstate="print">
-                      <a:extLst>
-                        <a:ext uri="{28A0092B-C50C-407E-A947-70E740481C1C}">
-                          <a14:useLocalDpi xmlns:a14="http://schemas.microsoft.com/office/drawing/2010/main" val="0"/>
-                        </a:ext>
-                      </a:extLst>
-                    </a:blip>
-                    <a:stretch>
-                      <a:fillRect/>
-                    </a:stretch>
-                  </pic:blipFill>
-                  <pic:spPr>
-                    <a:xfrm>
-                      <a:off x="0" y="0"/>
-                      <a:ext cx="5943600" cy="3604895"/>
-                    </a:xfrm>
-                    <a:prstGeom prst="rect">
-                      <a:avLst/>
-                    </a:prstGeom>
-                  </pic:spPr>
-                </pic:pic>
-              </a:graphicData>
-            </a:graphic>
-          </wp:inline>
-        </w:drawing>
-      </w:r>
-    </w:p>
-    <w:p>
-      <w:pPr>
-        <w:pStyle w:val="Caption"/>
-      </w:pPr>
-      <w:r>
-        <w:t>2 Movie Object (1.2)</w:t>
-      </w:r>
-    </w:p>
-    <w:p>
-      <w:pPr>
-        <w:keepNext/>
-      </w:pPr>
-      <w:r>
-        <w:rPr>
-          <w:noProof/>
-        </w:rPr>
-        <w:lastRenderedPageBreak/>
-        <w:drawing>
-          <wp:inline distT="0" distB="0" distL="0" distR="0" wp14:anchorId="285FE160" wp14:editId="13C3B61E">
-            <wp:extent cx="5943600" cy="3714750"/>
-            <wp:effectExtent l="0" t="0" r="0" b="6350"/>
-            <wp:docPr id="1890836309" name="Picture 4"/>
-            <wp:cNvGraphicFramePr>
-              <a:graphicFrameLocks xmlns:a="http://schemas.openxmlformats.org/drawingml/2006/main" noChangeAspect="1"/>
-            </wp:cNvGraphicFramePr>
-            <a:graphic xmlns:a="http://schemas.openxmlformats.org/drawingml/2006/main">
-              <a:graphicData uri="http://schemas.openxmlformats.org/drawingml/2006/picture">
-                <pic:pic xmlns:pic="http://schemas.openxmlformats.org/drawingml/2006/picture">
-                  <pic:nvPicPr>
-                    <pic:cNvPr id="1890836309" name="Picture 1890836309"/>
-                    <pic:cNvPicPr/>
-                  </pic:nvPicPr>
-                  <pic:blipFill>
-                    <a:blip r:embed="rId6" cstate="print">
                       <a:extLst>
                         <a:ext uri="{28A0092B-C50C-407E-A947-70E740481C1C}">
                           <a14:useLocalDpi xmlns:a14="http://schemas.microsoft.com/office/drawing/2010/main" val="0"/>
@@ -184,8 +58,218 @@
       <w:pPr>
         <w:pStyle w:val="Caption"/>
       </w:pPr>
+      <w:fldSimple w:instr=" SEQ Figure \* ARABIC ">
+        <w:r>
+          <w:rPr>
+            <w:noProof/>
+          </w:rPr>
+          <w:t>1</w:t>
+        </w:r>
+      </w:fldSimple>
       <w:r>
-        <w:t>3 Vegetarian Dinner (1.3)</w:t>
+        <w:t>For/In Loop</w:t>
+      </w:r>
+    </w:p>
+    <w:p>
+      <w:pPr>
+        <w:keepNext/>
+      </w:pPr>
+      <w:r>
+        <w:rPr>
+          <w:noProof/>
+        </w:rPr>
+        <w:drawing>
+          <wp:inline distT="0" distB="0" distL="0" distR="0" wp14:anchorId="7E264A51" wp14:editId="1F53BB20">
+            <wp:extent cx="5943600" cy="3714750"/>
+            <wp:effectExtent l="0" t="0" r="0" b="6350"/>
+            <wp:docPr id="1305952138" name="Picture 2"/>
+            <wp:cNvGraphicFramePr>
+              <a:graphicFrameLocks xmlns:a="http://schemas.openxmlformats.org/drawingml/2006/main" noChangeAspect="1"/>
+            </wp:cNvGraphicFramePr>
+            <a:graphic xmlns:a="http://schemas.openxmlformats.org/drawingml/2006/main">
+              <a:graphicData uri="http://schemas.openxmlformats.org/drawingml/2006/picture">
+                <pic:pic xmlns:pic="http://schemas.openxmlformats.org/drawingml/2006/picture">
+                  <pic:nvPicPr>
+                    <pic:cNvPr id="1305952138" name="Picture 1305952138"/>
+                    <pic:cNvPicPr/>
+                  </pic:nvPicPr>
+                  <pic:blipFill>
+                    <a:blip r:embed="rId5" cstate="print">
+                      <a:extLst>
+                        <a:ext uri="{28A0092B-C50C-407E-A947-70E740481C1C}">
+                          <a14:useLocalDpi xmlns:a14="http://schemas.microsoft.com/office/drawing/2010/main" val="0"/>
+                        </a:ext>
+                      </a:extLst>
+                    </a:blip>
+                    <a:stretch>
+                      <a:fillRect/>
+                    </a:stretch>
+                  </pic:blipFill>
+                  <pic:spPr>
+                    <a:xfrm>
+                      <a:off x="0" y="0"/>
+                      <a:ext cx="5943600" cy="3714750"/>
+                    </a:xfrm>
+                    <a:prstGeom prst="rect">
+                      <a:avLst/>
+                    </a:prstGeom>
+                  </pic:spPr>
+                </pic:pic>
+              </a:graphicData>
+            </a:graphic>
+          </wp:inline>
+        </w:drawing>
+      </w:r>
+    </w:p>
+    <w:p>
+      <w:pPr>
+        <w:pStyle w:val="Caption"/>
+      </w:pPr>
+      <w:fldSimple w:instr=" SEQ Figure \* ARABIC ">
+        <w:r>
+          <w:rPr>
+            <w:noProof/>
+          </w:rPr>
+          <w:t>2</w:t>
+        </w:r>
+      </w:fldSimple>
+      <w:r>
+        <w:t xml:space="preserve"> For/Of Loop</w:t>
+      </w:r>
+    </w:p>
+    <w:p>
+      <w:pPr>
+        <w:keepNext/>
+      </w:pPr>
+      <w:r>
+        <w:rPr>
+          <w:noProof/>
+        </w:rPr>
+        <w:lastRenderedPageBreak/>
+        <w:drawing>
+          <wp:inline distT="0" distB="0" distL="0" distR="0" wp14:anchorId="4ED9BB13" wp14:editId="40693645">
+            <wp:extent cx="5943600" cy="3626485"/>
+            <wp:effectExtent l="0" t="0" r="0" b="5715"/>
+            <wp:docPr id="447620307" name="Picture 3"/>
+            <wp:cNvGraphicFramePr>
+              <a:graphicFrameLocks xmlns:a="http://schemas.openxmlformats.org/drawingml/2006/main" noChangeAspect="1"/>
+            </wp:cNvGraphicFramePr>
+            <a:graphic xmlns:a="http://schemas.openxmlformats.org/drawingml/2006/main">
+              <a:graphicData uri="http://schemas.openxmlformats.org/drawingml/2006/picture">
+                <pic:pic xmlns:pic="http://schemas.openxmlformats.org/drawingml/2006/picture">
+                  <pic:nvPicPr>
+                    <pic:cNvPr id="447620307" name="Picture 447620307"/>
+                    <pic:cNvPicPr/>
+                  </pic:nvPicPr>
+                  <pic:blipFill>
+                    <a:blip r:embed="rId6" cstate="print">
+                      <a:extLst>
+                        <a:ext uri="{28A0092B-C50C-407E-A947-70E740481C1C}">
+                          <a14:useLocalDpi xmlns:a14="http://schemas.microsoft.com/office/drawing/2010/main" val="0"/>
+                        </a:ext>
+                      </a:extLst>
+                    </a:blip>
+                    <a:stretch>
+                      <a:fillRect/>
+                    </a:stretch>
+                  </pic:blipFill>
+                  <pic:spPr>
+                    <a:xfrm>
+                      <a:off x="0" y="0"/>
+                      <a:ext cx="5943600" cy="3626485"/>
+                    </a:xfrm>
+                    <a:prstGeom prst="rect">
+                      <a:avLst/>
+                    </a:prstGeom>
+                  </pic:spPr>
+                </pic:pic>
+              </a:graphicData>
+            </a:graphic>
+          </wp:inline>
+        </w:drawing>
+      </w:r>
+    </w:p>
+    <w:p>
+      <w:pPr>
+        <w:pStyle w:val="Caption"/>
+      </w:pPr>
+      <w:fldSimple w:instr=" SEQ Figure \* ARABIC ">
+        <w:r>
+          <w:rPr>
+            <w:noProof/>
+          </w:rPr>
+          <w:t>3</w:t>
+        </w:r>
+      </w:fldSimple>
+      <w:r>
+        <w:t xml:space="preserve"> While Loop</w:t>
+      </w:r>
+    </w:p>
+    <w:p>
+      <w:pPr>
+        <w:keepNext/>
+      </w:pPr>
+      <w:r>
+        <w:rPr>
+          <w:noProof/>
+        </w:rPr>
+        <w:drawing>
+          <wp:inline distT="0" distB="0" distL="0" distR="0" wp14:anchorId="19687616" wp14:editId="6E2C9BFD">
+            <wp:extent cx="5943600" cy="3714750"/>
+            <wp:effectExtent l="0" t="0" r="0" b="6350"/>
+            <wp:docPr id="1044165492" name="Picture 4"/>
+            <wp:cNvGraphicFramePr>
+              <a:graphicFrameLocks xmlns:a="http://schemas.openxmlformats.org/drawingml/2006/main" noChangeAspect="1"/>
+            </wp:cNvGraphicFramePr>
+            <a:graphic xmlns:a="http://schemas.openxmlformats.org/drawingml/2006/main">
+              <a:graphicData uri="http://schemas.openxmlformats.org/drawingml/2006/picture">
+                <pic:pic xmlns:pic="http://schemas.openxmlformats.org/drawingml/2006/picture">
+                  <pic:nvPicPr>
+                    <pic:cNvPr id="1044165492" name="Picture 1044165492"/>
+                    <pic:cNvPicPr/>
+                  </pic:nvPicPr>
+                  <pic:blipFill>
+                    <a:blip r:embed="rId7" cstate="print">
+                      <a:extLst>
+                        <a:ext uri="{28A0092B-C50C-407E-A947-70E740481C1C}">
+                          <a14:useLocalDpi xmlns:a14="http://schemas.microsoft.com/office/drawing/2010/main" val="0"/>
+                        </a:ext>
+                      </a:extLst>
+                    </a:blip>
+                    <a:stretch>
+                      <a:fillRect/>
+                    </a:stretch>
+                  </pic:blipFill>
+                  <pic:spPr>
+                    <a:xfrm>
+                      <a:off x="0" y="0"/>
+                      <a:ext cx="5943600" cy="3714750"/>
+                    </a:xfrm>
+                    <a:prstGeom prst="rect">
+                      <a:avLst/>
+                    </a:prstGeom>
+                  </pic:spPr>
+                </pic:pic>
+              </a:graphicData>
+            </a:graphic>
+          </wp:inline>
+        </w:drawing>
+      </w:r>
+    </w:p>
+    <w:p>
+      <w:pPr>
+        <w:pStyle w:val="Caption"/>
+      </w:pPr>
+      <w:fldSimple w:instr=" SEQ Figure \* ARABIC ">
+        <w:r>
+          <w:rPr>
+            <w:noProof/>
+          </w:rPr>
+          <w:t>4</w:t>
+        </w:r>
+      </w:fldSimple>
+      <w:r>
+        <w:t xml:space="preserve"> LinkedIn Code Challenge: Five Friends</w:t>
       </w:r>
     </w:p>
     <w:sectPr>

</xml_diff>